<commit_message>
court(wvactapp): amicus brief latex gated, counsel at the cover's foot, the conclusion kept with its signature (fb-595.54.66)
Co-Authored-By: Claude Opus 5.5 <noreply@anthropic.com>
</commit_message>
<xml_diff>
--- a/courts/fourth-circuit/west-virginia/state/intermediate-court-of-appeals/amicus-brief/usage/OUTPUT-amicus-brief.docx
+++ b/courts/fourth-circuit/west-virginia/state/intermediate-court-of-appeals/amicus-brief/usage/OUTPUT-amicus-brief.docx
@@ -715,7 +715,12 @@
     </w:p>
     <w:p>
       <w:pPr>
-        <w:spacing w:before="1728" w:after="0" w:line="276" w:lineRule="exact"/>
+        <w:spacing w:before="0" w:after="0" w:line="4994" w:lineRule="exact"/>
+      </w:pPr>
+    </w:p>
+    <w:p>
+      <w:pPr>
+        <w:spacing w:before="0" w:after="0" w:line="276" w:lineRule="exact"/>
         <w:ind w:left="4608" w:firstLine="0"/>
         <w:jc w:val="left"/>
       </w:pPr>
@@ -2150,7 +2155,7 @@
         <w:tab/>
       </w:r>
       <w:r>
-        <w:t xml:space="preserve">14</w:t>
+        <w:t xml:space="preserve">15</w:t>
       </w:r>
     </w:p>
     <w:p>
@@ -4807,7 +4812,7 @@
         <w:tab/>
       </w:r>
       <w:r>
-        <w:t xml:space="preserve">“A suspected drunken driver was arrested in a New Year’s Day highway crash that killed another motorist in West Virginia, police said. The accident occurred early Wednesday along southbound Interstate 81 in Berkeley County. . . . [Berkeley County Sheriff Curtis] Keller said a deputy investigating calls about a reckless driver attempted to make a traffic stop, but the suspect’s vehicle sped up and hit a car, which then struck a guardrail. The driver of the car was pronounced dead at the scene. The driver’s name was not immediately released.”</w:t>
+        <w:t xml:space="preserve">“A suspected drunken driver was arrested in a New Year’s Day highway crash that killed another motorist in West Virginia, police said. The accident occurred early Wednesday along southbound Interstate 81 in Berkeley County. . . . [Berkeley County Sheriff Curtis] Keller said a deputy investigating calls about a reckless driver attempted to make a traffic stop, but the suspect’s vehicle sped up and hit a car, which then struck a guardrail. The driver of the car was pronounced dead at the scene. The driver’s name was not immediately released.”</w:t>
       </w:r>
       <w:r>
         <w:rPr>
@@ -4877,7 +4882,7 @@
         <w:pStyle w:val="BodyTextNote"/>
       </w:pPr>
       <w:r>
-        <w:t xml:space="preserve">Among other restrictions, West Virginia law prohibits Lust from selling “any nonintoxicating beer, wine, or alcoholic liquors, for or to . . . any person who is physically incapacitated due to consumption of nonintoxicating beer, wine, or alcoholic liquor.”</w:t>
+        <w:t xml:space="preserve">Among other restrictions, West Virginia law prohibits Lust from selling “any nonintoxicating beer, wine, or alcoholic liquors, for or to . . . any person who is physically incapacitated due to consumption of nonintoxicating beer, wine, or alcoholic liquor.”</w:t>
       </w:r>
       <w:r>
         <w:rPr>
@@ -4889,7 +4894,7 @@
         <w:t xml:space="preserve"> </w:t>
       </w:r>
       <w:r>
-        <w:t xml:space="preserve">The Complaint alleges that Lust served Maydian “copious amounts of alcoholic beverages . . . . despite the fact that he exhibited physical signs of drunkenness and intoxication while upon the premises.”</w:t>
+        <w:t xml:space="preserve">The Complaint alleges that Lust served Maydian “copious amounts of alcoholic beverages . . . . despite the fact that he exhibited physical signs of drunkenness and intoxication while upon the premises.”</w:t>
       </w:r>
       <w:r>
         <w:rPr>
@@ -4901,19 +4906,7 @@
         <w:t xml:space="preserve"> </w:t>
       </w:r>
       <w:r>
-        <w:t xml:space="preserve">The conduct alleged in the complaint violated both W.Va. Code § 60</w:t>
-      </w:r>
-      <w:r>
-        <w:noBreakHyphen/>
-      </w:r>
-      <w:r>
-        <w:t xml:space="preserve">7</w:t>
-      </w:r>
-      <w:r>
-        <w:noBreakHyphen/>
-      </w:r>
-      <w:r>
-        <w:t xml:space="preserve">12(4)</w:t>
+        <w:t xml:space="preserve">The conduct alleged in the complaint violated both W.Va. Code § 60-⁠7-⁠12(4)</w:t>
       </w:r>
       <w:r>
         <w:t xml:space="preserve"> </w:t>
@@ -6049,7 +6042,7 @@
         <w:t xml:space="preserve"> </w:t>
       </w:r>
       <w:r>
-        <w:t xml:space="preserve">The Court applied the public policy exception and applied West Virginia law because Indiana’s bar to recovery violated West Virginia’s “strong public policy . . . that persons injured by the negligence of another should be able to recover in tort.”</w:t>
+        <w:t xml:space="preserve">The Court applied the public policy exception and applied West Virginia law because Indiana’s bar to recovery violated West Virginia’s “strong public policy . . . that persons injured by the negligence of another should be able to recover in tort.”</w:t>
       </w:r>
       <w:r>
         <w:rPr>
@@ -6951,7 +6944,7 @@
         <w:t xml:space="preserve"> </w:t>
       </w:r>
       <w:r>
-        <w:t xml:space="preserve">was not a West Virginia resident, Mylan is. As a West Virginia corporation, Mylan has taken advantage of the laws of West Virginia, and it cannot now complain that it is being held to their consequences. Presumably, Mylan has developed its business around an expectation that, as a West Virginia corporation, it will be subject to West Virginia tort law. . . . In contrast [to</w:t>
+        <w:t xml:space="preserve">was not a West Virginia resident, Mylan is. As a West Virginia corporation, Mylan has taken advantage of the laws of West Virginia, and it cannot now complain that it is being held to their consequences. Presumably, Mylan has developed its business around an expectation that, as a West Virginia corporation, it will be subject to West Virginia tort law. . . . In contrast [to</w:t>
       </w:r>
       <w:r>
         <w:t xml:space="preserve"> </w:t>
@@ -6999,7 +6992,7 @@
         <w:pStyle w:val="XdQuoteOnly"/>
       </w:pPr>
       <w:r>
-        <w:t xml:space="preserve">We found . . . that the Ohio plaintiffs were bound by the Ohio law as to the interpretation of their underinsured motorist coverage since most of the substantial contacts existed in Ohio with regard to their insurance coverage. We pointed out that it was not illogical to assume that a resident of Ohio, where the vehicle is garaged and where the insurance agent is located and the policy issued, might conclude that the Ohio law covered the interpretation of the policy coverage. Certainly, such an assumption would be more logical than the counter-assumption that the policyholder would believe the policy coverage would be determined by the laws of the state where the accident occurred.</w:t>
+        <w:t xml:space="preserve">We found . . . that the Ohio plaintiffs were bound by the Ohio law as to the interpretation of their underinsured motorist coverage since most of the substantial contacts existed in Ohio with regard to their insurance coverage. We pointed out that it was not illogical to assume that a resident of Ohio, where the vehicle is garaged and where the insurance agent is located and the policy issued, might conclude that the Ohio law covered the interpretation of the policy coverage. Certainly, such an assumption would be more logical than the counter-assumption that the policyholder would believe the policy coverage would be determined by the laws of the state where the accident occurred.</w:t>
       </w:r>
       <w:r>
         <w:rPr>
@@ -7467,7 +7460,7 @@
         <w:pStyle w:val="BodyTextNote"/>
       </w:pPr>
       <w:r>
-        <w:t xml:space="preserve">Here, in seeking the permission of the State to sell alcoholic beverages, Respondent Lust, promised to “comply at all times and observe all the provisions of West Virginia . . . Chapter 60, Articles 1 through 8 et seq., and all Federal and State Statutes and all other laws of this State.”</w:t>
+        <w:t xml:space="preserve">Here, in seeking the permission of the State to sell alcoholic beverages, Respondent Lust, promised to “comply at all times and observe all the provisions of West Virginia . . . Chapter 60, Articles 1 through 8 et seq., and all Federal and State Statutes and all other laws of this State.”</w:t>
       </w:r>
       <w:r>
         <w:rPr>
@@ -7479,7 +7472,7 @@
         <w:t xml:space="preserve"> </w:t>
       </w:r>
       <w:r>
-        <w:t xml:space="preserve">The laws of this State include the prohibition against selling “any nonintoxicating beer, wine, or alcoholic liquors, for or to . . . any person who is physically incapacitated due to consumption of nonintoxicating beer, wine, or alcoholic liquor.”</w:t>
+        <w:t xml:space="preserve">The laws of this State include the prohibition against selling “any nonintoxicating beer, wine, or alcoholic liquors, for or to . . . any person who is physically incapacitated due to consumption of nonintoxicating beer, wine, or alcoholic liquor.”</w:t>
       </w:r>
       <w:r>
         <w:rPr>
@@ -8380,7 +8373,7 @@
     </w:p>
     <w:p>
       <w:pPr>
-        <w:pStyle w:val="BodyText"/>
+        <w:pStyle w:val="BodyTextKeep"/>
       </w:pPr>
       <w:r>
         <w:t xml:space="preserve">Where a West Virginia bar overserves a patron who kills a West Virginia resident, West Virginia dram shop liability should be imposed on the West Virginia business even if the accident occurs over the border in another state.</w:t>
@@ -8388,6 +8381,8 @@
     </w:p>
     <w:p>
       <w:pPr>
+        <w:keepNext/>
+        <w:keepLines/>
         <w:spacing w:before="0" w:after="0" w:line="432" w:lineRule="exact"/>
       </w:pPr>
     </w:p>
@@ -9255,13 +9250,13 @@
         <w:t xml:space="preserve"> </w:t>
       </w:r>
       <w:r>
-        <w:t xml:space="preserve">https://www.heraldmailmedia.com/​story/​news/​local/2016/06/17/​martinsburg-man-charged-with-dui-following-fatal-i</w:t>
+        <w:t xml:space="preserve">https://​www.​heraldmailmedia.​com/​story/​news/​local/​2016/​06/​17/​martinsburg-​man-​charged-​with-​dui-​following-​fatal-​i</w:t>
       </w:r>
       <w:r>
         <w:noBreakHyphen/>
       </w:r>
       <w:r>
-        <w:t xml:space="preserve">81-crash/45644665/.</w:t>
+        <w:t xml:space="preserve">81-​crash/​45644665/​.</w:t>
       </w:r>
     </w:p>
   </w:footnote>
@@ -9280,25 +9275,25 @@
         <w:t xml:space="preserve"> </w:t>
       </w:r>
       <w:r>
-        <w:t xml:space="preserve">https://www.journal-news.net/​journal-news/​hagerstown-md-man-charged-with-deaths-in</w:t>
+        <w:t xml:space="preserve">https://​www.​journal-​news.​net/​journal-​news/​hagerstown-​md-​man-​charged-​with-​deaths-​in</w:t>
       </w:r>
       <w:r>
         <w:noBreakHyphen/>
       </w:r>
       <w:r>
-        <w:t xml:space="preserve">2019-dui-crash/​article_cbaf3050-b097</w:t>
+        <w:t xml:space="preserve">2019-​dui-​crash/​article_cbaf3050-​b097</w:t>
       </w:r>
       <w:r>
         <w:noBreakHyphen/>
       </w:r>
       <w:r>
-        <w:t xml:space="preserve">51b5-b16d</w:t>
+        <w:t xml:space="preserve">51b5-​b16d</w:t>
       </w:r>
       <w:r>
         <w:noBreakHyphen/>
       </w:r>
       <w:r>
-        <w:t xml:space="preserve">5ac8dce414b7.html?utm_medium=social&amp;utm_source=email&amp;utm_campaign=user-share.</w:t>
+        <w:t xml:space="preserve">5ac8dce414b7.​html?​utm_medium=social&amp;utm_source=email&amp;utm_campaign=user-​share.</w:t>
       </w:r>
     </w:p>
   </w:footnote>
@@ -9317,19 +9312,19 @@
         <w:t xml:space="preserve"> </w:t>
       </w:r>
       <w:r>
-        <w:t xml:space="preserve">https://www.heraldmailmedia.com/​story/​news/​local/2016/03/29/​martinsburg-wva-man-accused-of-dui-at</w:t>
+        <w:t xml:space="preserve">https://​www.​heraldmailmedia.​com/​story/​news/​local/​2016/​03/​29/​martinsburg-​wva-​man-​accused-​of-​dui-​at</w:t>
       </w:r>
       <w:r>
         <w:noBreakHyphen/>
       </w:r>
       <w:r>
-        <w:t xml:space="preserve">100-mph-on-i</w:t>
+        <w:t xml:space="preserve">100-​mph-​on-​i</w:t>
       </w:r>
       <w:r>
         <w:noBreakHyphen/>
       </w:r>
       <w:r>
-        <w:t xml:space="preserve">81/45625739/.</w:t>
+        <w:t xml:space="preserve">81/​45625739/​.</w:t>
       </w:r>
     </w:p>
   </w:footnote>
@@ -9348,13 +9343,13 @@
         <w:t xml:space="preserve"> </w:t>
       </w:r>
       <w:r>
-        <w:t xml:space="preserve">https://www.wsls.com/​news/​virginia/2020/01/01/32-year-old-arrested-after-deadly-new-years-day-dui-crash-on-interstate</w:t>
+        <w:t xml:space="preserve">https://​www.​wsls.​com/​news/​virginia/​2020/​01/​01/​32-​year-​old-​arrested-​after-​deadly-​new-​years-​day-​dui-​crash-​on-​interstate</w:t>
       </w:r>
       <w:r>
         <w:noBreakHyphen/>
       </w:r>
       <w:r>
-        <w:t xml:space="preserve">81-in-west-virginia/.</w:t>
+        <w:t xml:space="preserve">81-​in-​west-​virginia/​.</w:t>
       </w:r>
     </w:p>
   </w:footnote>
@@ -9373,19 +9368,19 @@
         <w:t xml:space="preserve"> </w:t>
       </w:r>
       <w:r>
-        <w:t xml:space="preserve">https://www.wdbj7.com/​content/​news/​One-killed-at-least-a-dozen-hurt-in-I</w:t>
+        <w:t xml:space="preserve">https://​www.​wdbj7.​com/​content/​news/​One-​killed-​at-​least-​a-​dozen-​hurt-​in-​I</w:t>
       </w:r>
       <w:r>
         <w:noBreakHyphen/>
       </w:r>
       <w:r>
-        <w:t xml:space="preserve">81-wreck-in-West-Virginia</w:t>
+        <w:t xml:space="preserve">81-​wreck-​in-​West-​Virginia</w:t>
       </w:r>
       <w:r>
         <w:noBreakHyphen/>
       </w:r>
       <w:r>
-        <w:t xml:space="preserve">383417931.html.</w:t>
+        <w:t xml:space="preserve">383417931.​html.</w:t>
       </w:r>
     </w:p>
   </w:footnote>
@@ -9404,7 +9399,7 @@
         <w:t xml:space="preserve"> </w:t>
       </w:r>
       <w:r>
-        <w:t xml:space="preserve">https://www.dcnewsnow.com/​news/​charles-town-detachment-of-west-virginia-state-police-leads-in-dui-arrests/ (“Police said many drunk drivers will make the short trip from bordering states to Jefferson County, where they can go to gentlemen’s clubs and the bars stay open later. . . .‘Well over 60 percent of [DUI arrests] are from Maryland or Virginia. Some are even coming from D.C. or Pennsylvania,’ said Trooper 1st Class Timothy Perry. ‘Most of them are definitely from out-of-state.’”).</w:t>
+        <w:t xml:space="preserve">https://​www.​dcnewsnow.​com/​news/​charles-​town-​detachment-​of-​west-​virginia-​state-​police-​leads-​in-​dui-​arrests/ (“Police said many drunk drivers will make the short trip from bordering states to Jefferson County, where they can go to gentlemen’s clubs and the bars stay open later. . . .‘Well over 60 percent of [DUI arrests] are from Maryland or Virginia. Some are even coming from D.C. or Pennsylvania,’ said Trooper 1st Class Timothy Perry. ‘Most of them are definitely from out-of-state.’”).</w:t>
       </w:r>
     </w:p>
   </w:footnote>
@@ -9423,13 +9418,13 @@
         <w:t xml:space="preserve"> </w:t>
       </w:r>
       <w:r>
-        <w:t xml:space="preserve">https://abca.wv.gov/​Documents/​ABC%20Forms/​Private-Clubs-Frat-catering-retail-license-on-premises-application</w:t>
+        <w:t xml:space="preserve">https://​abca.​wv.​gov/​Documents/​ABC%20Forms/​Private-​Clubs-​Frat-​catering-​retail-​license-​on-​premises-​application</w:t>
       </w:r>
       <w:r>
         <w:noBreakHyphen/>
       </w:r>
       <w:r>
-        <w:t xml:space="preserve">672023-FINAL.pdf.</w:t>
+        <w:t xml:space="preserve">672023-​FINAL.​pdf.</w:t>
       </w:r>
     </w:p>
   </w:footnote>
@@ -9448,19 +9443,7 @@
         <w:t xml:space="preserve"> </w:t>
       </w:r>
       <w:r>
-        <w:t xml:space="preserve">W.Va. Code § 60</w:t>
-      </w:r>
-      <w:r>
-        <w:noBreakHyphen/>
-      </w:r>
-      <w:r>
-        <w:t xml:space="preserve">7</w:t>
-      </w:r>
-      <w:r>
-        <w:noBreakHyphen/>
-      </w:r>
-      <w:r>
-        <w:t xml:space="preserve">12(4).</w:t>
+        <w:t xml:space="preserve">W.Va. Code § 60-⁠7-⁠12(4).</w:t>
       </w:r>
     </w:p>
   </w:footnote>
@@ -9479,13 +9462,7 @@
         <w:t xml:space="preserve"> </w:t>
       </w:r>
       <w:r>
-        <w:t xml:space="preserve">App. at 17, ¶¶ 27</w:t>
-      </w:r>
-      <w:r>
-        <w:noBreakHyphen/>
-      </w:r>
-      <w:r>
-        <w:t xml:space="preserve">29.</w:t>
+        <w:t xml:space="preserve">App. at 17, ¶¶ 27-⁠29.</w:t>
       </w:r>
     </w:p>
   </w:footnote>
@@ -9847,7 +9824,7 @@
         <w:t xml:space="preserve"> </w:t>
       </w:r>
       <w:r>
-        <w:t xml:space="preserve">through .902 (which provides that premises owners are not liable for off-premises mixed dust exposure).</w:t>
+        <w:t xml:space="preserve">through .902 (which provides that premises owners are not liable for off-premises mixed dust exposure).</w:t>
       </w:r>
     </w:p>
   </w:footnote>
@@ -10149,19 +10126,7 @@
         <w:t xml:space="preserve"> </w:t>
       </w:r>
       <w:r>
-        <w:t xml:space="preserve">W.Va. Code § 60</w:t>
-      </w:r>
-      <w:r>
-        <w:noBreakHyphen/>
-      </w:r>
-      <w:r>
-        <w:t xml:space="preserve">7</w:t>
-      </w:r>
-      <w:r>
-        <w:noBreakHyphen/>
-      </w:r>
-      <w:r>
-        <w:t xml:space="preserve">12(4).</w:t>
+        <w:t xml:space="preserve">W.Va. Code § 60-⁠7-⁠12(4).</w:t>
       </w:r>
     </w:p>
   </w:footnote>
@@ -11488,6 +11453,7 @@
     <w:unhideWhenUsed/>
     <w:qFormat/>
     <w:pPr>
+      <w:keepLines/>
       <w:spacing w:before="0" w:after="140" w:line="276" w:lineRule="exact"/>
     </w:pPr>
     <w:rPr>
@@ -11686,6 +11652,15 @@
       <w:ind w:firstLine="0"/>
     </w:pPr>
   </w:style>
+  <w:style w:type="paragraph" w:customStyle="1" w:styleId="BodyTextKeep">
+    <w:name w:val="Body Text Keep"/>
+    <w:basedOn w:val="BodyText"/>
+    <w:qFormat/>
+    <w:pPr>
+      <w:keepNext/>
+      <w:keepLines/>
+    </w:pPr>
+  </w:style>
   <w:style w:type="paragraph" w:customStyle="1" w:styleId="XdList1">
     <w:name w:val="XdList 1"/>
     <w:basedOn w:val="Normal"/>
@@ -11738,6 +11713,33 @@
     <w:pPr>
       <w:spacing w:before="0" w:after="0" w:line="276" w:lineRule="exact"/>
       <w:ind w:left="2160" w:hanging="720"/>
+    </w:pPr>
+  </w:style>
+  <w:style w:type="paragraph" w:customStyle="1" w:styleId="XdQuoteList1">
+    <w:name w:val="Xd Quote List 1"/>
+    <w:basedOn w:val="Normal"/>
+    <w:qFormat/>
+    <w:pPr>
+      <w:spacing w:before="0" w:after="0" w:line="276" w:lineRule="exact"/>
+      <w:ind w:left="1440" w:right="720" w:hanging="720"/>
+    </w:pPr>
+  </w:style>
+  <w:style w:type="paragraph" w:customStyle="1" w:styleId="XdQuoteList2">
+    <w:name w:val="Xd Quote List 2"/>
+    <w:basedOn w:val="Normal"/>
+    <w:qFormat/>
+    <w:pPr>
+      <w:spacing w:before="0" w:after="0" w:line="276" w:lineRule="exact"/>
+      <w:ind w:left="2160" w:right="720" w:hanging="720"/>
+    </w:pPr>
+  </w:style>
+  <w:style w:type="paragraph" w:customStyle="1" w:styleId="XdQuoteList3">
+    <w:name w:val="Xd Quote List 3"/>
+    <w:basedOn w:val="Normal"/>
+    <w:qFormat/>
+    <w:pPr>
+      <w:spacing w:before="0" w:after="0" w:line="276" w:lineRule="exact"/>
+      <w:ind w:left="2880" w:right="720" w:hanging="720"/>
     </w:pPr>
   </w:style>
   <w:style w:type="paragraph" w:customStyle="1" w:styleId="XdList1">

</xml_diff>